<commit_message>
Add email notifications via Resend
</commit_message>
<xml_diff>
--- a/ForexIntel Documentation.docx
+++ b/ForexIntel Documentation.docx
@@ -805,12 +805,6 @@
         <w:gridCol w:w="4960"/>
       </w:tblGrid>
       <w:tr>
-        <w:tblPrEx>
-          <w:tblCellMar>
-            <w:top w:w="0" w:type="dxa"/>
-            <w:bottom w:w="0" w:type="dxa"/>
-          </w:tblCellMar>
-        </w:tblPrEx>
         <w:tc>
           <w:tcPr>
             <w:tcW w:w="2000" w:type="dxa"/>
@@ -921,12 +915,6 @@
         </w:tc>
       </w:tr>
       <w:tr>
-        <w:tblPrEx>
-          <w:tblCellMar>
-            <w:top w:w="0" w:type="dxa"/>
-            <w:bottom w:w="0" w:type="dxa"/>
-          </w:tblCellMar>
-        </w:tblPrEx>
         <w:tc>
           <w:tcPr>
             <w:tcW w:w="2000" w:type="dxa"/>
@@ -1028,12 +1016,6 @@
         </w:tc>
       </w:tr>
       <w:tr>
-        <w:tblPrEx>
-          <w:tblCellMar>
-            <w:top w:w="0" w:type="dxa"/>
-            <w:bottom w:w="0" w:type="dxa"/>
-          </w:tblCellMar>
-        </w:tblPrEx>
         <w:tc>
           <w:tcPr>
             <w:tcW w:w="2000" w:type="dxa"/>
@@ -1145,12 +1127,6 @@
         </w:tc>
       </w:tr>
       <w:tr>
-        <w:tblPrEx>
-          <w:tblCellMar>
-            <w:top w:w="0" w:type="dxa"/>
-            <w:bottom w:w="0" w:type="dxa"/>
-          </w:tblCellMar>
-        </w:tblPrEx>
         <w:tc>
           <w:tcPr>
             <w:tcW w:w="2000" w:type="dxa"/>
@@ -1270,12 +1246,6 @@
         </w:tc>
       </w:tr>
       <w:tr>
-        <w:tblPrEx>
-          <w:tblCellMar>
-            <w:top w:w="0" w:type="dxa"/>
-            <w:bottom w:w="0" w:type="dxa"/>
-          </w:tblCellMar>
-        </w:tblPrEx>
         <w:tc>
           <w:tcPr>
             <w:tcW w:w="2000" w:type="dxa"/>
@@ -1395,12 +1365,6 @@
         </w:tc>
       </w:tr>
       <w:tr>
-        <w:tblPrEx>
-          <w:tblCellMar>
-            <w:top w:w="0" w:type="dxa"/>
-            <w:bottom w:w="0" w:type="dxa"/>
-          </w:tblCellMar>
-        </w:tblPrEx>
         <w:tc>
           <w:tcPr>
             <w:tcW w:w="2000" w:type="dxa"/>
@@ -1502,12 +1466,6 @@
         </w:tc>
       </w:tr>
       <w:tr>
-        <w:tblPrEx>
-          <w:tblCellMar>
-            <w:top w:w="0" w:type="dxa"/>
-            <w:bottom w:w="0" w:type="dxa"/>
-          </w:tblCellMar>
-        </w:tblPrEx>
         <w:tc>
           <w:tcPr>
             <w:tcW w:w="2000" w:type="dxa"/>
@@ -1609,12 +1567,6 @@
         </w:tc>
       </w:tr>
       <w:tr>
-        <w:tblPrEx>
-          <w:tblCellMar>
-            <w:top w:w="0" w:type="dxa"/>
-            <w:bottom w:w="0" w:type="dxa"/>
-          </w:tblCellMar>
-        </w:tblPrEx>
         <w:tc>
           <w:tcPr>
             <w:tcW w:w="2000" w:type="dxa"/>
@@ -1718,12 +1670,6 @@
         </w:tc>
       </w:tr>
       <w:tr>
-        <w:tblPrEx>
-          <w:tblCellMar>
-            <w:top w:w="0" w:type="dxa"/>
-            <w:bottom w:w="0" w:type="dxa"/>
-          </w:tblCellMar>
-        </w:tblPrEx>
         <w:tc>
           <w:tcPr>
             <w:tcW w:w="2000" w:type="dxa"/>
@@ -2772,14 +2718,12 @@
         </w:rPr>
         <w:t xml:space="preserve">Monitor your performance </w:t>
       </w:r>
-      <w:proofErr w:type="gramStart"/>
-      <w:r>
-        <w:rPr>
-          <w:rFonts w:ascii="Times New Roman" w:hAnsi="Times New Roman" w:cs="Times New Roman"/>
-        </w:rPr>
-        <w:t>stats</w:t>
-      </w:r>
-      <w:proofErr w:type="gramEnd"/>
+      <w:r>
+        <w:rPr>
+          <w:rFonts w:ascii="Times New Roman" w:hAnsi="Times New Roman" w:cs="Times New Roman"/>
+        </w:rPr>
+        <w:t>status</w:t>
+      </w:r>
       <w:r>
         <w:rPr>
           <w:rFonts w:ascii="Times New Roman" w:hAnsi="Times New Roman" w:cs="Times New Roman"/>
@@ -2865,21 +2809,7 @@
         <w:rPr>
           <w:rFonts w:ascii="Times New Roman" w:hAnsi="Times New Roman" w:cs="Times New Roman"/>
         </w:rPr>
-        <w:t xml:space="preserve">Professional candlestick chart powered by </w:t>
-      </w:r>
-      <w:proofErr w:type="spellStart"/>
-      <w:r>
-        <w:rPr>
-          <w:rFonts w:ascii="Times New Roman" w:hAnsi="Times New Roman" w:cs="Times New Roman"/>
-        </w:rPr>
-        <w:t>TradingView</w:t>
-      </w:r>
-      <w:proofErr w:type="spellEnd"/>
-      <w:r>
-        <w:rPr>
-          <w:rFonts w:ascii="Times New Roman" w:hAnsi="Times New Roman" w:cs="Times New Roman"/>
-        </w:rPr>
-        <w:t xml:space="preserve"> Lightweight Charts</w:t>
+        <w:t>Professional candlestick chart powered by TradingView Lightweight Charts</w:t>
       </w:r>
     </w:p>
     <w:p>
@@ -2900,14 +2830,12 @@
         </w:rPr>
         <w:t>EMA20 line (</w:t>
       </w:r>
-      <w:proofErr w:type="gramStart"/>
-      <w:r>
-        <w:rPr>
-          <w:rFonts w:ascii="Times New Roman" w:hAnsi="Times New Roman" w:cs="Times New Roman"/>
-        </w:rPr>
-        <w:t>blue) —</w:t>
-      </w:r>
-      <w:proofErr w:type="gramEnd"/>
+      <w:r>
+        <w:rPr>
+          <w:rFonts w:ascii="Times New Roman" w:hAnsi="Times New Roman" w:cs="Times New Roman"/>
+        </w:rPr>
+        <w:t>blue)</w:t>
+      </w:r>
       <w:r>
         <w:rPr>
           <w:rFonts w:ascii="Times New Roman" w:hAnsi="Times New Roman" w:cs="Times New Roman"/>
@@ -2933,14 +2861,12 @@
         </w:rPr>
         <w:t>EMA50 line (</w:t>
       </w:r>
-      <w:proofErr w:type="gramStart"/>
-      <w:r>
-        <w:rPr>
-          <w:rFonts w:ascii="Times New Roman" w:hAnsi="Times New Roman" w:cs="Times New Roman"/>
-        </w:rPr>
-        <w:t>orange) —</w:t>
-      </w:r>
-      <w:proofErr w:type="gramEnd"/>
+      <w:r>
+        <w:rPr>
+          <w:rFonts w:ascii="Times New Roman" w:hAnsi="Times New Roman" w:cs="Times New Roman"/>
+        </w:rPr>
+        <w:t>orange)</w:t>
+      </w:r>
       <w:r>
         <w:rPr>
           <w:rFonts w:ascii="Times New Roman" w:hAnsi="Times New Roman" w:cs="Times New Roman"/>
@@ -2966,14 +2892,12 @@
         </w:rPr>
         <w:t xml:space="preserve">Stop Loss level (red dotted </w:t>
       </w:r>
-      <w:proofErr w:type="gramStart"/>
-      <w:r>
-        <w:rPr>
-          <w:rFonts w:ascii="Times New Roman" w:hAnsi="Times New Roman" w:cs="Times New Roman"/>
-        </w:rPr>
-        <w:t>line) —</w:t>
-      </w:r>
-      <w:proofErr w:type="gramEnd"/>
+      <w:r>
+        <w:rPr>
+          <w:rFonts w:ascii="Times New Roman" w:hAnsi="Times New Roman" w:cs="Times New Roman"/>
+        </w:rPr>
+        <w:t>line)</w:t>
+      </w:r>
       <w:r>
         <w:rPr>
           <w:rFonts w:ascii="Times New Roman" w:hAnsi="Times New Roman" w:cs="Times New Roman"/>
@@ -2999,14 +2923,12 @@
         </w:rPr>
         <w:t xml:space="preserve">Take Profit 1 level (green dotted </w:t>
       </w:r>
-      <w:proofErr w:type="gramStart"/>
-      <w:r>
-        <w:rPr>
-          <w:rFonts w:ascii="Times New Roman" w:hAnsi="Times New Roman" w:cs="Times New Roman"/>
-        </w:rPr>
-        <w:t>line) —</w:t>
-      </w:r>
-      <w:proofErr w:type="gramEnd"/>
+      <w:r>
+        <w:rPr>
+          <w:rFonts w:ascii="Times New Roman" w:hAnsi="Times New Roman" w:cs="Times New Roman"/>
+        </w:rPr>
+        <w:t>line)</w:t>
+      </w:r>
       <w:r>
         <w:rPr>
           <w:rFonts w:ascii="Times New Roman" w:hAnsi="Times New Roman" w:cs="Times New Roman"/>
@@ -3049,21 +2971,7 @@
         <w:rPr>
           <w:rFonts w:ascii="Times New Roman" w:hAnsi="Times New Roman" w:cs="Times New Roman"/>
         </w:rPr>
-        <w:t xml:space="preserve">Latest AI Signal panel — direction, confidence, entry, SL, TP, </w:t>
-      </w:r>
-      <w:proofErr w:type="gramStart"/>
-      <w:r>
-        <w:rPr>
-          <w:rFonts w:ascii="Times New Roman" w:hAnsi="Times New Roman" w:cs="Times New Roman"/>
-        </w:rPr>
-        <w:t>R:R</w:t>
-      </w:r>
-      <w:proofErr w:type="gramEnd"/>
-      <w:r>
-        <w:rPr>
-          <w:rFonts w:ascii="Times New Roman" w:hAnsi="Times New Roman" w:cs="Times New Roman"/>
-        </w:rPr>
-        <w:t>, AI explanation</w:t>
+        <w:t>Latest AI Signal panel — direction, confidence, entry, SL, TP, R:R, AI explanation</w:t>
       </w:r>
     </w:p>
     <w:p>
@@ -3228,12 +3136,6 @@
         <w:gridCol w:w="5360"/>
       </w:tblGrid>
       <w:tr>
-        <w:tblPrEx>
-          <w:tblCellMar>
-            <w:top w:w="0" w:type="dxa"/>
-            <w:bottom w:w="0" w:type="dxa"/>
-          </w:tblCellMar>
-        </w:tblPrEx>
         <w:tc>
           <w:tcPr>
             <w:tcW w:w="1500" w:type="dxa"/>
@@ -3344,12 +3246,6 @@
         </w:tc>
       </w:tr>
       <w:tr>
-        <w:tblPrEx>
-          <w:tblCellMar>
-            <w:top w:w="0" w:type="dxa"/>
-            <w:bottom w:w="0" w:type="dxa"/>
-          </w:tblCellMar>
-        </w:tblPrEx>
         <w:tc>
           <w:tcPr>
             <w:tcW w:w="1500" w:type="dxa"/>
@@ -3451,12 +3347,6 @@
         </w:tc>
       </w:tr>
       <w:tr>
-        <w:tblPrEx>
-          <w:tblCellMar>
-            <w:top w:w="0" w:type="dxa"/>
-            <w:bottom w:w="0" w:type="dxa"/>
-          </w:tblCellMar>
-        </w:tblPrEx>
         <w:tc>
           <w:tcPr>
             <w:tcW w:w="1500" w:type="dxa"/>
@@ -3558,12 +3448,6 @@
         </w:tc>
       </w:tr>
       <w:tr>
-        <w:tblPrEx>
-          <w:tblCellMar>
-            <w:top w:w="0" w:type="dxa"/>
-            <w:bottom w:w="0" w:type="dxa"/>
-          </w:tblCellMar>
-        </w:tblPrEx>
         <w:tc>
           <w:tcPr>
             <w:tcW w:w="1500" w:type="dxa"/>
@@ -3665,12 +3549,6 @@
         </w:tc>
       </w:tr>
       <w:tr>
-        <w:tblPrEx>
-          <w:tblCellMar>
-            <w:top w:w="0" w:type="dxa"/>
-            <w:bottom w:w="0" w:type="dxa"/>
-          </w:tblCellMar>
-        </w:tblPrEx>
         <w:tc>
           <w:tcPr>
             <w:tcW w:w="1500" w:type="dxa"/>
@@ -4164,12 +4042,6 @@
         <w:gridCol w:w="5860"/>
       </w:tblGrid>
       <w:tr>
-        <w:tblPrEx>
-          <w:tblCellMar>
-            <w:top w:w="0" w:type="dxa"/>
-            <w:bottom w:w="0" w:type="dxa"/>
-          </w:tblCellMar>
-        </w:tblPrEx>
         <w:tc>
           <w:tcPr>
             <w:tcW w:w="1500" w:type="dxa"/>
@@ -4280,12 +4152,6 @@
         </w:tc>
       </w:tr>
       <w:tr>
-        <w:tblPrEx>
-          <w:tblCellMar>
-            <w:top w:w="0" w:type="dxa"/>
-            <w:bottom w:w="0" w:type="dxa"/>
-          </w:tblCellMar>
-        </w:tblPrEx>
         <w:tc>
           <w:tcPr>
             <w:tcW w:w="1500" w:type="dxa"/>
@@ -4387,12 +4253,6 @@
         </w:tc>
       </w:tr>
       <w:tr>
-        <w:tblPrEx>
-          <w:tblCellMar>
-            <w:top w:w="0" w:type="dxa"/>
-            <w:bottom w:w="0" w:type="dxa"/>
-          </w:tblCellMar>
-        </w:tblPrEx>
         <w:tc>
           <w:tcPr>
             <w:tcW w:w="1500" w:type="dxa"/>
@@ -4494,12 +4354,6 @@
         </w:tc>
       </w:tr>
       <w:tr>
-        <w:tblPrEx>
-          <w:tblCellMar>
-            <w:top w:w="0" w:type="dxa"/>
-            <w:bottom w:w="0" w:type="dxa"/>
-          </w:tblCellMar>
-        </w:tblPrEx>
         <w:tc>
           <w:tcPr>
             <w:tcW w:w="1500" w:type="dxa"/>
@@ -4601,12 +4455,6 @@
         </w:tc>
       </w:tr>
       <w:tr>
-        <w:tblPrEx>
-          <w:tblCellMar>
-            <w:top w:w="0" w:type="dxa"/>
-            <w:bottom w:w="0" w:type="dxa"/>
-          </w:tblCellMar>
-        </w:tblPrEx>
         <w:tc>
           <w:tcPr>
             <w:tcW w:w="1500" w:type="dxa"/>
@@ -5145,12 +4993,6 @@
         <w:gridCol w:w="3160"/>
       </w:tblGrid>
       <w:tr>
-        <w:tblPrEx>
-          <w:tblCellMar>
-            <w:top w:w="0" w:type="dxa"/>
-            <w:bottom w:w="0" w:type="dxa"/>
-          </w:tblCellMar>
-        </w:tblPrEx>
         <w:tc>
           <w:tcPr>
             <w:tcW w:w="2000" w:type="dxa"/>
@@ -5297,12 +5139,6 @@
         </w:tc>
       </w:tr>
       <w:tr>
-        <w:tblPrEx>
-          <w:tblCellMar>
-            <w:top w:w="0" w:type="dxa"/>
-            <w:bottom w:w="0" w:type="dxa"/>
-          </w:tblCellMar>
-        </w:tblPrEx>
         <w:tc>
           <w:tcPr>
             <w:tcW w:w="2000" w:type="dxa"/>
@@ -5437,12 +5273,6 @@
         </w:tc>
       </w:tr>
       <w:tr>
-        <w:tblPrEx>
-          <w:tblCellMar>
-            <w:top w:w="0" w:type="dxa"/>
-            <w:bottom w:w="0" w:type="dxa"/>
-          </w:tblCellMar>
-        </w:tblPrEx>
         <w:tc>
           <w:tcPr>
             <w:tcW w:w="2000" w:type="dxa"/>
@@ -5577,12 +5407,6 @@
         </w:tc>
       </w:tr>
       <w:tr>
-        <w:tblPrEx>
-          <w:tblCellMar>
-            <w:top w:w="0" w:type="dxa"/>
-            <w:bottom w:w="0" w:type="dxa"/>
-          </w:tblCellMar>
-        </w:tblPrEx>
         <w:tc>
           <w:tcPr>
             <w:tcW w:w="2000" w:type="dxa"/>
@@ -5717,12 +5541,6 @@
         </w:tc>
       </w:tr>
       <w:tr>
-        <w:tblPrEx>
-          <w:tblCellMar>
-            <w:top w:w="0" w:type="dxa"/>
-            <w:bottom w:w="0" w:type="dxa"/>
-          </w:tblCellMar>
-        </w:tblPrEx>
         <w:tc>
           <w:tcPr>
             <w:tcW w:w="2000" w:type="dxa"/>
@@ -5857,12 +5675,6 @@
         </w:tc>
       </w:tr>
       <w:tr>
-        <w:tblPrEx>
-          <w:tblCellMar>
-            <w:top w:w="0" w:type="dxa"/>
-            <w:bottom w:w="0" w:type="dxa"/>
-          </w:tblCellMar>
-        </w:tblPrEx>
         <w:tc>
           <w:tcPr>
             <w:tcW w:w="2000" w:type="dxa"/>
@@ -5997,12 +5809,6 @@
         </w:tc>
       </w:tr>
       <w:tr>
-        <w:tblPrEx>
-          <w:tblCellMar>
-            <w:top w:w="0" w:type="dxa"/>
-            <w:bottom w:w="0" w:type="dxa"/>
-          </w:tblCellMar>
-        </w:tblPrEx>
         <w:tc>
           <w:tcPr>
             <w:tcW w:w="2000" w:type="dxa"/>
@@ -6901,12 +6707,6 @@
         <w:gridCol w:w="3360"/>
       </w:tblGrid>
       <w:tr>
-        <w:tblPrEx>
-          <w:tblCellMar>
-            <w:top w:w="0" w:type="dxa"/>
-            <w:bottom w:w="0" w:type="dxa"/>
-          </w:tblCellMar>
-        </w:tblPrEx>
         <w:tc>
           <w:tcPr>
             <w:tcW w:w="2000" w:type="dxa"/>
@@ -7017,12 +6817,6 @@
         </w:tc>
       </w:tr>
       <w:tr>
-        <w:tblPrEx>
-          <w:tblCellMar>
-            <w:top w:w="0" w:type="dxa"/>
-            <w:bottom w:w="0" w:type="dxa"/>
-          </w:tblCellMar>
-        </w:tblPrEx>
         <w:tc>
           <w:tcPr>
             <w:tcW w:w="2000" w:type="dxa"/>
@@ -7124,12 +6918,6 @@
         </w:tc>
       </w:tr>
       <w:tr>
-        <w:tblPrEx>
-          <w:tblCellMar>
-            <w:top w:w="0" w:type="dxa"/>
-            <w:bottom w:w="0" w:type="dxa"/>
-          </w:tblCellMar>
-        </w:tblPrEx>
         <w:tc>
           <w:tcPr>
             <w:tcW w:w="2000" w:type="dxa"/>
@@ -7231,12 +7019,6 @@
         </w:tc>
       </w:tr>
       <w:tr>
-        <w:tblPrEx>
-          <w:tblCellMar>
-            <w:top w:w="0" w:type="dxa"/>
-            <w:bottom w:w="0" w:type="dxa"/>
-          </w:tblCellMar>
-        </w:tblPrEx>
         <w:tc>
           <w:tcPr>
             <w:tcW w:w="2000" w:type="dxa"/>
@@ -7338,12 +7120,6 @@
         </w:tc>
       </w:tr>
       <w:tr>
-        <w:tblPrEx>
-          <w:tblCellMar>
-            <w:top w:w="0" w:type="dxa"/>
-            <w:bottom w:w="0" w:type="dxa"/>
-          </w:tblCellMar>
-        </w:tblPrEx>
         <w:tc>
           <w:tcPr>
             <w:tcW w:w="2000" w:type="dxa"/>
@@ -7455,12 +7231,6 @@
         </w:tc>
       </w:tr>
       <w:tr>
-        <w:tblPrEx>
-          <w:tblCellMar>
-            <w:top w:w="0" w:type="dxa"/>
-            <w:bottom w:w="0" w:type="dxa"/>
-          </w:tblCellMar>
-        </w:tblPrEx>
         <w:tc>
           <w:tcPr>
             <w:tcW w:w="2000" w:type="dxa"/>
@@ -7735,12 +7505,6 @@
         <w:gridCol w:w="4760"/>
       </w:tblGrid>
       <w:tr>
-        <w:tblPrEx>
-          <w:tblCellMar>
-            <w:top w:w="0" w:type="dxa"/>
-            <w:bottom w:w="0" w:type="dxa"/>
-          </w:tblCellMar>
-        </w:tblPrEx>
         <w:tc>
           <w:tcPr>
             <w:tcW w:w="1800" w:type="dxa"/>
@@ -7851,12 +7615,6 @@
         </w:tc>
       </w:tr>
       <w:tr>
-        <w:tblPrEx>
-          <w:tblCellMar>
-            <w:top w:w="0" w:type="dxa"/>
-            <w:bottom w:w="0" w:type="dxa"/>
-          </w:tblCellMar>
-        </w:tblPrEx>
         <w:tc>
           <w:tcPr>
             <w:tcW w:w="1800" w:type="dxa"/>
@@ -7958,12 +7716,6 @@
         </w:tc>
       </w:tr>
       <w:tr>
-        <w:tblPrEx>
-          <w:tblCellMar>
-            <w:top w:w="0" w:type="dxa"/>
-            <w:bottom w:w="0" w:type="dxa"/>
-          </w:tblCellMar>
-        </w:tblPrEx>
         <w:tc>
           <w:tcPr>
             <w:tcW w:w="1800" w:type="dxa"/>
@@ -8065,12 +7817,6 @@
         </w:tc>
       </w:tr>
       <w:tr>
-        <w:tblPrEx>
-          <w:tblCellMar>
-            <w:top w:w="0" w:type="dxa"/>
-            <w:bottom w:w="0" w:type="dxa"/>
-          </w:tblCellMar>
-        </w:tblPrEx>
         <w:tc>
           <w:tcPr>
             <w:tcW w:w="1800" w:type="dxa"/>
@@ -8172,12 +7918,6 @@
         </w:tc>
       </w:tr>
       <w:tr>
-        <w:tblPrEx>
-          <w:tblCellMar>
-            <w:top w:w="0" w:type="dxa"/>
-            <w:bottom w:w="0" w:type="dxa"/>
-          </w:tblCellMar>
-        </w:tblPrEx>
         <w:tc>
           <w:tcPr>
             <w:tcW w:w="1800" w:type="dxa"/>
@@ -8279,12 +8019,6 @@
         </w:tc>
       </w:tr>
       <w:tr>
-        <w:tblPrEx>
-          <w:tblCellMar>
-            <w:top w:w="0" w:type="dxa"/>
-            <w:bottom w:w="0" w:type="dxa"/>
-          </w:tblCellMar>
-        </w:tblPrEx>
         <w:tc>
           <w:tcPr>
             <w:tcW w:w="1800" w:type="dxa"/>
@@ -8386,12 +8120,6 @@
         </w:tc>
       </w:tr>
       <w:tr>
-        <w:tblPrEx>
-          <w:tblCellMar>
-            <w:top w:w="0" w:type="dxa"/>
-            <w:bottom w:w="0" w:type="dxa"/>
-          </w:tblCellMar>
-        </w:tblPrEx>
         <w:tc>
           <w:tcPr>
             <w:tcW w:w="1800" w:type="dxa"/>
@@ -8943,12 +8671,6 @@
         <w:gridCol w:w="4160"/>
       </w:tblGrid>
       <w:tr>
-        <w:tblPrEx>
-          <w:tblCellMar>
-            <w:top w:w="0" w:type="dxa"/>
-            <w:bottom w:w="0" w:type="dxa"/>
-          </w:tblCellMar>
-        </w:tblPrEx>
         <w:tc>
           <w:tcPr>
             <w:tcW w:w="2400" w:type="dxa"/>
@@ -9059,12 +8781,6 @@
         </w:tc>
       </w:tr>
       <w:tr>
-        <w:tblPrEx>
-          <w:tblCellMar>
-            <w:top w:w="0" w:type="dxa"/>
-            <w:bottom w:w="0" w:type="dxa"/>
-          </w:tblCellMar>
-        </w:tblPrEx>
         <w:tc>
           <w:tcPr>
             <w:tcW w:w="2400" w:type="dxa"/>
@@ -9166,12 +8882,6 @@
         </w:tc>
       </w:tr>
       <w:tr>
-        <w:tblPrEx>
-          <w:tblCellMar>
-            <w:top w:w="0" w:type="dxa"/>
-            <w:bottom w:w="0" w:type="dxa"/>
-          </w:tblCellMar>
-        </w:tblPrEx>
         <w:tc>
           <w:tcPr>
             <w:tcW w:w="2400" w:type="dxa"/>
@@ -9273,12 +8983,6 @@
         </w:tc>
       </w:tr>
       <w:tr>
-        <w:tblPrEx>
-          <w:tblCellMar>
-            <w:top w:w="0" w:type="dxa"/>
-            <w:bottom w:w="0" w:type="dxa"/>
-          </w:tblCellMar>
-        </w:tblPrEx>
         <w:tc>
           <w:tcPr>
             <w:tcW w:w="2400" w:type="dxa"/>
@@ -9380,12 +9084,6 @@
         </w:tc>
       </w:tr>
       <w:tr>
-        <w:tblPrEx>
-          <w:tblCellMar>
-            <w:top w:w="0" w:type="dxa"/>
-            <w:bottom w:w="0" w:type="dxa"/>
-          </w:tblCellMar>
-        </w:tblPrEx>
         <w:tc>
           <w:tcPr>
             <w:tcW w:w="2400" w:type="dxa"/>
@@ -9487,12 +9185,6 @@
         </w:tc>
       </w:tr>
       <w:tr>
-        <w:tblPrEx>
-          <w:tblCellMar>
-            <w:top w:w="0" w:type="dxa"/>
-            <w:bottom w:w="0" w:type="dxa"/>
-          </w:tblCellMar>
-        </w:tblPrEx>
         <w:tc>
           <w:tcPr>
             <w:tcW w:w="2400" w:type="dxa"/>
@@ -9594,12 +9286,6 @@
         </w:tc>
       </w:tr>
       <w:tr>
-        <w:tblPrEx>
-          <w:tblCellMar>
-            <w:top w:w="0" w:type="dxa"/>
-            <w:bottom w:w="0" w:type="dxa"/>
-          </w:tblCellMar>
-        </w:tblPrEx>
         <w:tc>
           <w:tcPr>
             <w:tcW w:w="2400" w:type="dxa"/>
@@ -9901,12 +9587,6 @@
         <w:gridCol w:w="3560"/>
       </w:tblGrid>
       <w:tr>
-        <w:tblPrEx>
-          <w:tblCellMar>
-            <w:top w:w="0" w:type="dxa"/>
-            <w:bottom w:w="0" w:type="dxa"/>
-          </w:tblCellMar>
-        </w:tblPrEx>
         <w:tc>
           <w:tcPr>
             <w:tcW w:w="1500" w:type="dxa"/>
@@ -10053,12 +9733,6 @@
         </w:tc>
       </w:tr>
       <w:tr>
-        <w:tblPrEx>
-          <w:tblCellMar>
-            <w:top w:w="0" w:type="dxa"/>
-            <w:bottom w:w="0" w:type="dxa"/>
-          </w:tblCellMar>
-        </w:tblPrEx>
         <w:tc>
           <w:tcPr>
             <w:tcW w:w="1500" w:type="dxa"/>
@@ -10193,12 +9867,6 @@
         </w:tc>
       </w:tr>
       <w:tr>
-        <w:tblPrEx>
-          <w:tblCellMar>
-            <w:top w:w="0" w:type="dxa"/>
-            <w:bottom w:w="0" w:type="dxa"/>
-          </w:tblCellMar>
-        </w:tblPrEx>
         <w:tc>
           <w:tcPr>
             <w:tcW w:w="1500" w:type="dxa"/>
@@ -10333,12 +10001,6 @@
         </w:tc>
       </w:tr>
       <w:tr>
-        <w:tblPrEx>
-          <w:tblCellMar>
-            <w:top w:w="0" w:type="dxa"/>
-            <w:bottom w:w="0" w:type="dxa"/>
-          </w:tblCellMar>
-        </w:tblPrEx>
         <w:tc>
           <w:tcPr>
             <w:tcW w:w="1500" w:type="dxa"/>
@@ -10473,12 +10135,6 @@
         </w:tc>
       </w:tr>
       <w:tr>
-        <w:tblPrEx>
-          <w:tblCellMar>
-            <w:top w:w="0" w:type="dxa"/>
-            <w:bottom w:w="0" w:type="dxa"/>
-          </w:tblCellMar>
-        </w:tblPrEx>
         <w:tc>
           <w:tcPr>
             <w:tcW w:w="1500" w:type="dxa"/>
@@ -10954,12 +10610,6 @@
         <w:gridCol w:w="4860"/>
       </w:tblGrid>
       <w:tr>
-        <w:tblPrEx>
-          <w:tblCellMar>
-            <w:top w:w="0" w:type="dxa"/>
-            <w:bottom w:w="0" w:type="dxa"/>
-          </w:tblCellMar>
-        </w:tblPrEx>
         <w:tc>
           <w:tcPr>
             <w:tcW w:w="2500" w:type="dxa"/>
@@ -11070,12 +10720,6 @@
         </w:tc>
       </w:tr>
       <w:tr>
-        <w:tblPrEx>
-          <w:tblCellMar>
-            <w:top w:w="0" w:type="dxa"/>
-            <w:bottom w:w="0" w:type="dxa"/>
-          </w:tblCellMar>
-        </w:tblPrEx>
         <w:tc>
           <w:tcPr>
             <w:tcW w:w="2500" w:type="dxa"/>
@@ -11178,12 +10822,6 @@
         </w:tc>
       </w:tr>
       <w:tr>
-        <w:tblPrEx>
-          <w:tblCellMar>
-            <w:top w:w="0" w:type="dxa"/>
-            <w:bottom w:w="0" w:type="dxa"/>
-          </w:tblCellMar>
-        </w:tblPrEx>
         <w:tc>
           <w:tcPr>
             <w:tcW w:w="2500" w:type="dxa"/>
@@ -11285,12 +10923,6 @@
         </w:tc>
       </w:tr>
       <w:tr>
-        <w:tblPrEx>
-          <w:tblCellMar>
-            <w:top w:w="0" w:type="dxa"/>
-            <w:bottom w:w="0" w:type="dxa"/>
-          </w:tblCellMar>
-        </w:tblPrEx>
         <w:tc>
           <w:tcPr>
             <w:tcW w:w="2500" w:type="dxa"/>
@@ -11392,12 +11024,6 @@
         </w:tc>
       </w:tr>
       <w:tr>
-        <w:tblPrEx>
-          <w:tblCellMar>
-            <w:top w:w="0" w:type="dxa"/>
-            <w:bottom w:w="0" w:type="dxa"/>
-          </w:tblCellMar>
-        </w:tblPrEx>
         <w:tc>
           <w:tcPr>
             <w:tcW w:w="2500" w:type="dxa"/>
@@ -11499,12 +11125,6 @@
         </w:tc>
       </w:tr>
       <w:tr>
-        <w:tblPrEx>
-          <w:tblCellMar>
-            <w:top w:w="0" w:type="dxa"/>
-            <w:bottom w:w="0" w:type="dxa"/>
-          </w:tblCellMar>
-        </w:tblPrEx>
         <w:tc>
           <w:tcPr>
             <w:tcW w:w="2500" w:type="dxa"/>
@@ -11606,12 +11226,6 @@
         </w:tc>
       </w:tr>
       <w:tr>
-        <w:tblPrEx>
-          <w:tblCellMar>
-            <w:top w:w="0" w:type="dxa"/>
-            <w:bottom w:w="0" w:type="dxa"/>
-          </w:tblCellMar>
-        </w:tblPrEx>
         <w:tc>
           <w:tcPr>
             <w:tcW w:w="2500" w:type="dxa"/>
@@ -11955,12 +11569,6 @@
         <w:gridCol w:w="4160"/>
       </w:tblGrid>
       <w:tr>
-        <w:tblPrEx>
-          <w:tblCellMar>
-            <w:top w:w="0" w:type="dxa"/>
-            <w:bottom w:w="0" w:type="dxa"/>
-          </w:tblCellMar>
-        </w:tblPrEx>
         <w:tc>
           <w:tcPr>
             <w:tcW w:w="2200" w:type="dxa"/>
@@ -12071,12 +11679,6 @@
         </w:tc>
       </w:tr>
       <w:tr>
-        <w:tblPrEx>
-          <w:tblCellMar>
-            <w:top w:w="0" w:type="dxa"/>
-            <w:bottom w:w="0" w:type="dxa"/>
-          </w:tblCellMar>
-        </w:tblPrEx>
         <w:tc>
           <w:tcPr>
             <w:tcW w:w="2200" w:type="dxa"/>
@@ -12178,12 +11780,6 @@
         </w:tc>
       </w:tr>
       <w:tr>
-        <w:tblPrEx>
-          <w:tblCellMar>
-            <w:top w:w="0" w:type="dxa"/>
-            <w:bottom w:w="0" w:type="dxa"/>
-          </w:tblCellMar>
-        </w:tblPrEx>
         <w:tc>
           <w:tcPr>
             <w:tcW w:w="2200" w:type="dxa"/>
@@ -12285,12 +11881,6 @@
         </w:tc>
       </w:tr>
       <w:tr>
-        <w:tblPrEx>
-          <w:tblCellMar>
-            <w:top w:w="0" w:type="dxa"/>
-            <w:bottom w:w="0" w:type="dxa"/>
-          </w:tblCellMar>
-        </w:tblPrEx>
         <w:tc>
           <w:tcPr>
             <w:tcW w:w="2200" w:type="dxa"/>
@@ -12392,12 +11982,6 @@
         </w:tc>
       </w:tr>
       <w:tr>
-        <w:tblPrEx>
-          <w:tblCellMar>
-            <w:top w:w="0" w:type="dxa"/>
-            <w:bottom w:w="0" w:type="dxa"/>
-          </w:tblCellMar>
-        </w:tblPrEx>
         <w:tc>
           <w:tcPr>
             <w:tcW w:w="2200" w:type="dxa"/>
@@ -12499,12 +12083,6 @@
         </w:tc>
       </w:tr>
       <w:tr>
-        <w:tblPrEx>
-          <w:tblCellMar>
-            <w:top w:w="0" w:type="dxa"/>
-            <w:bottom w:w="0" w:type="dxa"/>
-          </w:tblCellMar>
-        </w:tblPrEx>
         <w:tc>
           <w:tcPr>
             <w:tcW w:w="2200" w:type="dxa"/>
@@ -13215,12 +12793,6 @@
         <w:gridCol w:w="6360"/>
       </w:tblGrid>
       <w:tr>
-        <w:tblPrEx>
-          <w:tblCellMar>
-            <w:top w:w="0" w:type="dxa"/>
-            <w:bottom w:w="0" w:type="dxa"/>
-          </w:tblCellMar>
-        </w:tblPrEx>
         <w:tc>
           <w:tcPr>
             <w:tcW w:w="3000" w:type="dxa"/>
@@ -13295,12 +12867,6 @@
         </w:tc>
       </w:tr>
       <w:tr>
-        <w:tblPrEx>
-          <w:tblCellMar>
-            <w:top w:w="0" w:type="dxa"/>
-            <w:bottom w:w="0" w:type="dxa"/>
-          </w:tblCellMar>
-        </w:tblPrEx>
         <w:tc>
           <w:tcPr>
             <w:tcW w:w="3000" w:type="dxa"/>
@@ -13369,12 +12935,6 @@
         </w:tc>
       </w:tr>
       <w:tr>
-        <w:tblPrEx>
-          <w:tblCellMar>
-            <w:top w:w="0" w:type="dxa"/>
-            <w:bottom w:w="0" w:type="dxa"/>
-          </w:tblCellMar>
-        </w:tblPrEx>
         <w:tc>
           <w:tcPr>
             <w:tcW w:w="3000" w:type="dxa"/>
@@ -13443,12 +13003,6 @@
         </w:tc>
       </w:tr>
       <w:tr>
-        <w:tblPrEx>
-          <w:tblCellMar>
-            <w:top w:w="0" w:type="dxa"/>
-            <w:bottom w:w="0" w:type="dxa"/>
-          </w:tblCellMar>
-        </w:tblPrEx>
         <w:tc>
           <w:tcPr>
             <w:tcW w:w="3000" w:type="dxa"/>
@@ -13517,12 +13071,6 @@
         </w:tc>
       </w:tr>
       <w:tr>
-        <w:tblPrEx>
-          <w:tblCellMar>
-            <w:top w:w="0" w:type="dxa"/>
-            <w:bottom w:w="0" w:type="dxa"/>
-          </w:tblCellMar>
-        </w:tblPrEx>
         <w:tc>
           <w:tcPr>
             <w:tcW w:w="3000" w:type="dxa"/>
@@ -13591,12 +13139,6 @@
         </w:tc>
       </w:tr>
       <w:tr>
-        <w:tblPrEx>
-          <w:tblCellMar>
-            <w:top w:w="0" w:type="dxa"/>
-            <w:bottom w:w="0" w:type="dxa"/>
-          </w:tblCellMar>
-        </w:tblPrEx>
         <w:tc>
           <w:tcPr>
             <w:tcW w:w="3000" w:type="dxa"/>
@@ -13710,12 +13252,6 @@
         <w:gridCol w:w="3860"/>
       </w:tblGrid>
       <w:tr>
-        <w:tblPrEx>
-          <w:tblCellMar>
-            <w:top w:w="0" w:type="dxa"/>
-            <w:bottom w:w="0" w:type="dxa"/>
-          </w:tblCellMar>
-        </w:tblPrEx>
         <w:tc>
           <w:tcPr>
             <w:tcW w:w="2000" w:type="dxa"/>
@@ -13826,12 +13362,6 @@
         </w:tc>
       </w:tr>
       <w:tr>
-        <w:tblPrEx>
-          <w:tblCellMar>
-            <w:top w:w="0" w:type="dxa"/>
-            <w:bottom w:w="0" w:type="dxa"/>
-          </w:tblCellMar>
-        </w:tblPrEx>
         <w:tc>
           <w:tcPr>
             <w:tcW w:w="2000" w:type="dxa"/>
@@ -13935,12 +13465,6 @@
         </w:tc>
       </w:tr>
       <w:tr>
-        <w:tblPrEx>
-          <w:tblCellMar>
-            <w:top w:w="0" w:type="dxa"/>
-            <w:bottom w:w="0" w:type="dxa"/>
-          </w:tblCellMar>
-        </w:tblPrEx>
         <w:tc>
           <w:tcPr>
             <w:tcW w:w="2000" w:type="dxa"/>
@@ -14042,12 +13566,6 @@
         </w:tc>
       </w:tr>
       <w:tr>
-        <w:tblPrEx>
-          <w:tblCellMar>
-            <w:top w:w="0" w:type="dxa"/>
-            <w:bottom w:w="0" w:type="dxa"/>
-          </w:tblCellMar>
-        </w:tblPrEx>
         <w:tc>
           <w:tcPr>
             <w:tcW w:w="2000" w:type="dxa"/>
@@ -14149,12 +13667,6 @@
         </w:tc>
       </w:tr>
       <w:tr>
-        <w:tblPrEx>
-          <w:tblCellMar>
-            <w:top w:w="0" w:type="dxa"/>
-            <w:bottom w:w="0" w:type="dxa"/>
-          </w:tblCellMar>
-        </w:tblPrEx>
         <w:tc>
           <w:tcPr>
             <w:tcW w:w="2000" w:type="dxa"/>
@@ -14256,12 +13768,6 @@
         </w:tc>
       </w:tr>
       <w:tr>
-        <w:tblPrEx>
-          <w:tblCellMar>
-            <w:top w:w="0" w:type="dxa"/>
-            <w:bottom w:w="0" w:type="dxa"/>
-          </w:tblCellMar>
-        </w:tblPrEx>
         <w:tc>
           <w:tcPr>
             <w:tcW w:w="2000" w:type="dxa"/>
@@ -14649,12 +14155,6 @@
         <w:gridCol w:w="4060"/>
       </w:tblGrid>
       <w:tr>
-        <w:tblPrEx>
-          <w:tblCellMar>
-            <w:top w:w="0" w:type="dxa"/>
-            <w:bottom w:w="0" w:type="dxa"/>
-          </w:tblCellMar>
-        </w:tblPrEx>
         <w:tc>
           <w:tcPr>
             <w:tcW w:w="2000" w:type="dxa"/>
@@ -14801,12 +14301,6 @@
         </w:tc>
       </w:tr>
       <w:tr>
-        <w:tblPrEx>
-          <w:tblCellMar>
-            <w:top w:w="0" w:type="dxa"/>
-            <w:bottom w:w="0" w:type="dxa"/>
-          </w:tblCellMar>
-        </w:tblPrEx>
         <w:tc>
           <w:tcPr>
             <w:tcW w:w="2000" w:type="dxa"/>
@@ -14941,12 +14435,6 @@
         </w:tc>
       </w:tr>
       <w:tr>
-        <w:tblPrEx>
-          <w:tblCellMar>
-            <w:top w:w="0" w:type="dxa"/>
-            <w:bottom w:w="0" w:type="dxa"/>
-          </w:tblCellMar>
-        </w:tblPrEx>
         <w:tc>
           <w:tcPr>
             <w:tcW w:w="2000" w:type="dxa"/>
@@ -15081,12 +14569,6 @@
         </w:tc>
       </w:tr>
       <w:tr>
-        <w:tblPrEx>
-          <w:tblCellMar>
-            <w:top w:w="0" w:type="dxa"/>
-            <w:bottom w:w="0" w:type="dxa"/>
-          </w:tblCellMar>
-        </w:tblPrEx>
         <w:tc>
           <w:tcPr>
             <w:tcW w:w="2000" w:type="dxa"/>
@@ -15221,12 +14703,6 @@
         </w:tc>
       </w:tr>
       <w:tr>
-        <w:tblPrEx>
-          <w:tblCellMar>
-            <w:top w:w="0" w:type="dxa"/>
-            <w:bottom w:w="0" w:type="dxa"/>
-          </w:tblCellMar>
-        </w:tblPrEx>
         <w:tc>
           <w:tcPr>
             <w:tcW w:w="2000" w:type="dxa"/>
@@ -15361,12 +14837,6 @@
         </w:tc>
       </w:tr>
       <w:tr>
-        <w:tblPrEx>
-          <w:tblCellMar>
-            <w:top w:w="0" w:type="dxa"/>
-            <w:bottom w:w="0" w:type="dxa"/>
-          </w:tblCellMar>
-        </w:tblPrEx>
         <w:tc>
           <w:tcPr>
             <w:tcW w:w="2000" w:type="dxa"/>
@@ -15501,12 +14971,6 @@
         </w:tc>
       </w:tr>
       <w:tr>
-        <w:tblPrEx>
-          <w:tblCellMar>
-            <w:top w:w="0" w:type="dxa"/>
-            <w:bottom w:w="0" w:type="dxa"/>
-          </w:tblCellMar>
-        </w:tblPrEx>
         <w:tc>
           <w:tcPr>
             <w:tcW w:w="2000" w:type="dxa"/>
@@ -16080,12 +15544,6 @@
         <w:gridCol w:w="4360"/>
       </w:tblGrid>
       <w:tr>
-        <w:tblPrEx>
-          <w:tblCellMar>
-            <w:top w:w="0" w:type="dxa"/>
-            <w:bottom w:w="0" w:type="dxa"/>
-          </w:tblCellMar>
-        </w:tblPrEx>
         <w:tc>
           <w:tcPr>
             <w:tcW w:w="3500" w:type="dxa"/>
@@ -16196,12 +15654,6 @@
         </w:tc>
       </w:tr>
       <w:tr>
-        <w:tblPrEx>
-          <w:tblCellMar>
-            <w:top w:w="0" w:type="dxa"/>
-            <w:bottom w:w="0" w:type="dxa"/>
-          </w:tblCellMar>
-        </w:tblPrEx>
         <w:tc>
           <w:tcPr>
             <w:tcW w:w="3500" w:type="dxa"/>
@@ -16303,12 +15755,6 @@
         </w:tc>
       </w:tr>
       <w:tr>
-        <w:tblPrEx>
-          <w:tblCellMar>
-            <w:top w:w="0" w:type="dxa"/>
-            <w:bottom w:w="0" w:type="dxa"/>
-          </w:tblCellMar>
-        </w:tblPrEx>
         <w:tc>
           <w:tcPr>
             <w:tcW w:w="3500" w:type="dxa"/>
@@ -16446,12 +15892,6 @@
         </w:tc>
       </w:tr>
       <w:tr>
-        <w:tblPrEx>
-          <w:tblCellMar>
-            <w:top w:w="0" w:type="dxa"/>
-            <w:bottom w:w="0" w:type="dxa"/>
-          </w:tblCellMar>
-        </w:tblPrEx>
         <w:tc>
           <w:tcPr>
             <w:tcW w:w="3500" w:type="dxa"/>
@@ -17104,12 +16544,6 @@
         <w:gridCol w:w="5160"/>
       </w:tblGrid>
       <w:tr>
-        <w:tblPrEx>
-          <w:tblCellMar>
-            <w:top w:w="0" w:type="dxa"/>
-            <w:bottom w:w="0" w:type="dxa"/>
-          </w:tblCellMar>
-        </w:tblPrEx>
         <w:tc>
           <w:tcPr>
             <w:tcW w:w="2200" w:type="dxa"/>
@@ -17220,12 +16654,6 @@
         </w:tc>
       </w:tr>
       <w:tr>
-        <w:tblPrEx>
-          <w:tblCellMar>
-            <w:top w:w="0" w:type="dxa"/>
-            <w:bottom w:w="0" w:type="dxa"/>
-          </w:tblCellMar>
-        </w:tblPrEx>
         <w:tc>
           <w:tcPr>
             <w:tcW w:w="2200" w:type="dxa"/>
@@ -17327,12 +16755,6 @@
         </w:tc>
       </w:tr>
       <w:tr>
-        <w:tblPrEx>
-          <w:tblCellMar>
-            <w:top w:w="0" w:type="dxa"/>
-            <w:bottom w:w="0" w:type="dxa"/>
-          </w:tblCellMar>
-        </w:tblPrEx>
         <w:tc>
           <w:tcPr>
             <w:tcW w:w="2200" w:type="dxa"/>
@@ -17446,12 +16868,6 @@
         </w:tc>
       </w:tr>
       <w:tr>
-        <w:tblPrEx>
-          <w:tblCellMar>
-            <w:top w:w="0" w:type="dxa"/>
-            <w:bottom w:w="0" w:type="dxa"/>
-          </w:tblCellMar>
-        </w:tblPrEx>
         <w:tc>
           <w:tcPr>
             <w:tcW w:w="2200" w:type="dxa"/>
@@ -17553,12 +16969,6 @@
         </w:tc>
       </w:tr>
       <w:tr>
-        <w:tblPrEx>
-          <w:tblCellMar>
-            <w:top w:w="0" w:type="dxa"/>
-            <w:bottom w:w="0" w:type="dxa"/>
-          </w:tblCellMar>
-        </w:tblPrEx>
         <w:tc>
           <w:tcPr>
             <w:tcW w:w="2200" w:type="dxa"/>
@@ -17660,12 +17070,6 @@
         </w:tc>
       </w:tr>
       <w:tr>
-        <w:tblPrEx>
-          <w:tblCellMar>
-            <w:top w:w="0" w:type="dxa"/>
-            <w:bottom w:w="0" w:type="dxa"/>
-          </w:tblCellMar>
-        </w:tblPrEx>
         <w:tc>
           <w:tcPr>
             <w:tcW w:w="2200" w:type="dxa"/>
@@ -17767,12 +17171,6 @@
         </w:tc>
       </w:tr>
       <w:tr>
-        <w:tblPrEx>
-          <w:tblCellMar>
-            <w:top w:w="0" w:type="dxa"/>
-            <w:bottom w:w="0" w:type="dxa"/>
-          </w:tblCellMar>
-        </w:tblPrEx>
         <w:tc>
           <w:tcPr>
             <w:tcW w:w="2200" w:type="dxa"/>
@@ -17875,12 +17273,6 @@
         </w:tc>
       </w:tr>
       <w:tr>
-        <w:tblPrEx>
-          <w:tblCellMar>
-            <w:top w:w="0" w:type="dxa"/>
-            <w:bottom w:w="0" w:type="dxa"/>
-          </w:tblCellMar>
-        </w:tblPrEx>
         <w:tc>
           <w:tcPr>
             <w:tcW w:w="2200" w:type="dxa"/>
@@ -18072,12 +17464,6 @@
         <w:gridCol w:w="3160"/>
       </w:tblGrid>
       <w:tr>
-        <w:tblPrEx>
-          <w:tblCellMar>
-            <w:top w:w="0" w:type="dxa"/>
-            <w:bottom w:w="0" w:type="dxa"/>
-          </w:tblCellMar>
-        </w:tblPrEx>
         <w:tc>
           <w:tcPr>
             <w:tcW w:w="1400" w:type="dxa"/>
@@ -18296,12 +17682,6 @@
         </w:tc>
       </w:tr>
       <w:tr>
-        <w:tblPrEx>
-          <w:tblCellMar>
-            <w:top w:w="0" w:type="dxa"/>
-            <w:bottom w:w="0" w:type="dxa"/>
-          </w:tblCellMar>
-        </w:tblPrEx>
         <w:tc>
           <w:tcPr>
             <w:tcW w:w="1400" w:type="dxa"/>
@@ -18502,12 +17882,6 @@
         </w:tc>
       </w:tr>
       <w:tr>
-        <w:tblPrEx>
-          <w:tblCellMar>
-            <w:top w:w="0" w:type="dxa"/>
-            <w:bottom w:w="0" w:type="dxa"/>
-          </w:tblCellMar>
-        </w:tblPrEx>
         <w:tc>
           <w:tcPr>
             <w:tcW w:w="1400" w:type="dxa"/>
@@ -18708,12 +18082,6 @@
         </w:tc>
       </w:tr>
       <w:tr>
-        <w:tblPrEx>
-          <w:tblCellMar>
-            <w:top w:w="0" w:type="dxa"/>
-            <w:bottom w:w="0" w:type="dxa"/>
-          </w:tblCellMar>
-        </w:tblPrEx>
         <w:tc>
           <w:tcPr>
             <w:tcW w:w="1400" w:type="dxa"/>
@@ -18914,12 +18282,6 @@
         </w:tc>
       </w:tr>
       <w:tr>
-        <w:tblPrEx>
-          <w:tblCellMar>
-            <w:top w:w="0" w:type="dxa"/>
-            <w:bottom w:w="0" w:type="dxa"/>
-          </w:tblCellMar>
-        </w:tblPrEx>
         <w:tc>
           <w:tcPr>
             <w:tcW w:w="1400" w:type="dxa"/>
@@ -19120,12 +18482,6 @@
         </w:tc>
       </w:tr>
       <w:tr>
-        <w:tblPrEx>
-          <w:tblCellMar>
-            <w:top w:w="0" w:type="dxa"/>
-            <w:bottom w:w="0" w:type="dxa"/>
-          </w:tblCellMar>
-        </w:tblPrEx>
         <w:tc>
           <w:tcPr>
             <w:tcW w:w="1400" w:type="dxa"/>
@@ -19469,12 +18825,6 @@
         <w:gridCol w:w="4660"/>
       </w:tblGrid>
       <w:tr>
-        <w:tblPrEx>
-          <w:tblCellMar>
-            <w:top w:w="0" w:type="dxa"/>
-            <w:bottom w:w="0" w:type="dxa"/>
-          </w:tblCellMar>
-        </w:tblPrEx>
         <w:tc>
           <w:tcPr>
             <w:tcW w:w="2200" w:type="dxa"/>
@@ -19585,12 +18935,6 @@
         </w:tc>
       </w:tr>
       <w:tr>
-        <w:tblPrEx>
-          <w:tblCellMar>
-            <w:top w:w="0" w:type="dxa"/>
-            <w:bottom w:w="0" w:type="dxa"/>
-          </w:tblCellMar>
-        </w:tblPrEx>
         <w:tc>
           <w:tcPr>
             <w:tcW w:w="2200" w:type="dxa"/>
@@ -19710,12 +19054,6 @@
         </w:tc>
       </w:tr>
       <w:tr>
-        <w:tblPrEx>
-          <w:tblCellMar>
-            <w:top w:w="0" w:type="dxa"/>
-            <w:bottom w:w="0" w:type="dxa"/>
-          </w:tblCellMar>
-        </w:tblPrEx>
         <w:tc>
           <w:tcPr>
             <w:tcW w:w="2200" w:type="dxa"/>
@@ -19817,12 +19155,6 @@
         </w:tc>
       </w:tr>
       <w:tr>
-        <w:tblPrEx>
-          <w:tblCellMar>
-            <w:top w:w="0" w:type="dxa"/>
-            <w:bottom w:w="0" w:type="dxa"/>
-          </w:tblCellMar>
-        </w:tblPrEx>
         <w:tc>
           <w:tcPr>
             <w:tcW w:w="2200" w:type="dxa"/>
@@ -19924,12 +19256,6 @@
         </w:tc>
       </w:tr>
       <w:tr>
-        <w:tblPrEx>
-          <w:tblCellMar>
-            <w:top w:w="0" w:type="dxa"/>
-            <w:bottom w:w="0" w:type="dxa"/>
-          </w:tblCellMar>
-        </w:tblPrEx>
         <w:tc>
           <w:tcPr>
             <w:tcW w:w="2200" w:type="dxa"/>

</xml_diff>